<commit_message>
Finalize session 2 report with corrected box model explanation and expanded checks
</commit_message>
<xml_diff>
--- a/bao-cao/BaiTap_Buoi2_TruongThanhPhong_31241024967.docx
+++ b/bao-cao/BaiTap_Buoi2_TruongThanhPhong_31241024967.docx
@@ -1183,7 +1183,7 @@
                 <w:rFonts w:ascii="Times New Roman" w:hAnsi="Times New Roman"/>
                 <w:sz w:val="20"/>
               </w:rPr>
-              <w:t xml:space="preserve">Đã xác nhận tại 768 px: mô tả min-height 72 px, khối giá118 px, dù media trước đặt44/108 px.</w:t>
+              <w:t xml:space="preserve">Đã xác nhận tại 768 px: mô tả min-height 72 px, khối giá 118 px, dù media trước đặt 44/108 px.</w:t>
             </w:r>
           </w:p>
         </w:tc>
@@ -1329,7 +1329,7 @@
                 <w:rFonts w:ascii="Times New Roman" w:hAnsi="Times New Roman"/>
                 <w:sz w:val="20"/>
               </w:rPr>
-              <w:t xml:space="preserve">Summary có transition-duration 0s; biểu tượng có chuyển đổi riêng. Focus đã có, không nhận là thiếu hoàn toàn.</w:t>
+              <w:t xml:space="preserve">Summary có transition-duration 0 s; biểu tượng có chuyển đổi riêng. Focus đã có, không nhận là thiếu hoàn toàn.</w:t>
             </w:r>
           </w:p>
         </w:tc>
@@ -1346,7 +1346,7 @@
                 <w:rFonts w:ascii="Times New Roman" w:hAnsi="Times New Roman"/>
                 <w:sz w:val="20"/>
               </w:rPr>
-              <w:t xml:space="preserve">Transition màu180 ms, hover xanh/trắng, focus-visible rõ, giữ giảm chuyển động.</w:t>
+              <w:t xml:space="preserve">Transition màu 180 ms, hover xanh/trắng, focus-visible rõ, giữ giảm chuyển động.</w:t>
             </w:r>
           </w:p>
         </w:tc>
@@ -2198,7 +2198,7 @@
         <w:pStyle w:val="BodyText"/>
       </w:pPr>
       <w:r>
-        <w:t xml:space="preserve">Cách kiểm tra đường dẫn: xem phần Network để chắc request css/style.css không404, rồi xem Computed để xác nhận font/màu/padding. Trong phiên hỗ trợ, Playwright kiểm tra stylesheet có cssRules và giá trị thực tính. Nếu CSS mất tác dụng, cần kiểm tra đường dẫn tương đối, tên tệp/chữ hoa thường, cache và selector bị ghi đè; không sửa ngẫu nhiên nhiều nơi.</w:t>
+        <w:t xml:space="preserve">Cách kiểm tra đường dẫn: xem phần Network để chắc request css/style.css không trả 404, rồi xem Computed để xác nhận font/màu/padding. Trong phiên hỗ trợ, Playwright kiểm tra stylesheet có cssRules và giá trị thực tính. Nếu CSS mất tác dụng, cần kiểm tra đường dẫn tương đối, tên tệp/chữ hoa thường, cache và selector bị ghi đè; không sửa ngẫu nhiên nhiều nơi.</w:t>
       </w:r>
     </w:p>
     <w:bookmarkEnd w:id="29"/>
@@ -2945,7 +2945,7 @@
         <w:t xml:space="preserve"> </w:t>
       </w:r>
       <w:r>
-        <w:t xml:space="preserve">để ảnh vẫn sát viền trên của article; ở ≤580 px là20 px. Khoảng giữa các thẻ do Grid gap 24 px, không cộng margin tùy ý lên từng li.</w:t>
+        <w:t xml:space="preserve">để ảnh vẫn sát viền trên của article; ở ≤580 px là 20 px. Khoảng giữa các thẻ do Grid gap 24 px, không cộng margin tùy ý lên từng li.</w:t>
       </w:r>
     </w:p>
     <w:p>
@@ -2953,7 +2953,7 @@
         <w:pStyle w:val="BodyText"/>
       </w:pPr>
       <w:r>
-        <w:t xml:space="preserve">Tại1366 px: article rộng302 px; hai viền 1 px còn300 px cho vùng con. Vùng</w:t>
+        <w:t xml:space="preserve">Tại 1366 px: article rộng 302 px; hai viền 1 px còn 300 px cho vùng con. Vùng</w:t>
       </w:r>
       <w:r>
         <w:t xml:space="preserve"> </w:t>
@@ -2968,7 +2968,7 @@
         <w:t xml:space="preserve"> </w:t>
       </w:r>
       <w:r>
-        <w:t xml:space="preserve">có padding24 px mỗi bên nên nội dung còn</w:t>
+        <w:t xml:space="preserve">có padding 24 px mỗi bên nên nội dung còn</w:t>
       </w:r>
       <w:r>
         <w:t xml:space="preserve"> </w:t>
@@ -3045,7 +3045,7 @@
           <wp:inline>
             <wp:extent cx="2251636" cy="3960000"/>
             <wp:effectExtent b="0" l="0" r="0" t="0"/>
-            <wp:docPr descr="Hình 2. Sau sửa — cùng thẻ ở 768 px. Mô tả đo khoảng47,59 px theo nội dung, thay min-height 72 px; padding nội dung24 px. Ảnh giữ trọn tỷ lệ4/3." title="" id="31" name="Picture"/>
+            <wp:docPr descr="Hình 2. Sau sửa — cùng thẻ ở 768 px. Mô tả đo khoảng 47,59 px theo nội dung, thay min-height 72 px; padding nội dung 24 px. Ảnh giữ trọn tỷ lệ 4/3." title="" id="31" name="Picture"/>
             <a:graphic>
               <a:graphicData uri="http://schemas.openxmlformats.org/drawingml/2006/picture">
                 <pic:pic>
@@ -3093,7 +3093,7 @@
           <w:i/>
           <w:sz w:val="20"/>
         </w:rPr>
-        <w:t>Hình 2. Sau sửa — cùng thẻ ở 768 px. Mô tả đo khoảng47,59 px theo nội dung, thay min-height 72 px; padding nội dung24 px. Ảnh giữ trọn tỷ lệ4/3.</w:t>
+        <w:t>Hình 2. Sau sửa — cùng thẻ ở 768 px. Mô tả đo khoảng 47,59 px theo nội dung, thay min-height 72 px; padding nội dung 24 px. Ảnh giữ trọn tỷ lệ 4/3.</w:t>
       </w:r>
     </w:p>
     <w:bookmarkEnd w:id="33"/>
@@ -3330,7 +3330,7 @@
         <w:pStyle w:val="FirstParagraph"/>
       </w:pPr>
       <w:r>
-        <w:t xml:space="preserve">Với flex-direction mặc định row, justify-content theo trục ngang; align-items theo trục dọc. Space-between đưa hai mục về hai đầu vùng nội dung; gap 12 px không đồng nghĩa khoảng thực tế luôn12 px, vì phần trống còn được phân phối.</w:t>
+        <w:t xml:space="preserve">Với flex-direction mặc định row, justify-content theo trục ngang; align-items theo trục dọc. Space-between đưa hai mục về hai đầu vùng nội dung; gap 12 px không đồng nghĩa khoảng thực tế luôn 12 px, vì phần trống còn được phân phối.</w:t>
       </w:r>
     </w:p>
     <w:tbl>
@@ -3444,7 +3444,7 @@
                 <w:rFonts w:ascii="Times New Roman" w:hAnsi="Times New Roman"/>
                 <w:sz w:val="20"/>
               </w:rPr>
-              <w:t xml:space="preserve">Cặp nhãn/+ về đầu, khoảng giữa12 px.</w:t>
+              <w:t xml:space="preserve">Cặp nhãn/+ về đầu, khoảng giữa 12 px.</w:t>
             </w:r>
           </w:p>
         </w:tc>
@@ -3500,7 +3500,7 @@
                 <w:rFonts w:ascii="Times New Roman" w:hAnsi="Times New Roman"/>
                 <w:sz w:val="20"/>
               </w:rPr>
-              <w:t xml:space="preserve">Cặp nhãn/+ ở giữa, khoảng giữa12 px.</w:t>
+              <w:t xml:space="preserve">Cặp nhãn/+ ở giữa, khoảng giữa 12 px.</w:t>
             </w:r>
           </w:p>
         </w:tc>
@@ -3556,7 +3556,7 @@
                 <w:rFonts w:ascii="Times New Roman" w:hAnsi="Times New Roman"/>
                 <w:sz w:val="20"/>
               </w:rPr>
-              <w:t xml:space="preserve">Hai mục về hai đầu; khoảng thực tế khoảng129,73 px.</w:t>
+              <w:t xml:space="preserve">Hai mục về hai đầu; khoảng thực tế khoảng 129,73 px.</w:t>
             </w:r>
           </w:p>
         </w:tc>
@@ -3664,7 +3664,7 @@
         <w:pStyle w:val="FirstParagraph"/>
       </w:pPr>
       <w:r>
-        <w:t xml:space="preserve">Danh sách tiếp tục bốn sản phẩm cũ. Đã thử repeat(2,...) và repeat(3,...): tại viewport 1366 px, vùng lưới1280 px/gap 24 px cho hai cột628 px và ba cột khoảng410,66 px. Cấu hình cuối giữ bốn cột ở &gt;1100 px, hai cột ở &gt;580–1100 px, một cột ở ≤580 px.</w:t>
+        <w:t xml:space="preserve">Danh sách tiếp tục bốn sản phẩm cũ. Đã thử repeat(2,...) và repeat(3,...): tại viewport 1366 px, vùng lưới 1280 px/gap 24 px cho hai cột 628 px và ba cột khoảng 410,66 px. Cấu hình cuối giữ bốn cột ở &gt;1100 px, hai cột ở &gt;580–1100 px, một cột ở ≤580 px.</w:t>
       </w:r>
     </w:p>
     <w:p>
@@ -4006,7 +4006,7 @@
         <w:pStyle w:val="BodyText"/>
       </w:pPr>
       <w:r>
-        <w:t xml:space="preserve">Ảnh SVG gốc640×480; CSS giữ aspect-ratio4/3 và object-fit:contain. Cover lấp đầy khung nhưng có thể cắt ảnh khi khác tỷ lệ; contain được chọn để giữ trọn minh họa. Không chép cover từ ví dụ rồi làm mất một phần sản phẩm.</w:t>
+        <w:t xml:space="preserve">Ảnh SVG gốc 640 × 480; CSS giữ aspect-ratio 4/3 và object-fit:contain. Cover lấp đầy khung nhưng có thể cắt ảnh khi khác tỷ lệ; contain được chọn để giữ trọn minh họa. Không chép cover từ ví dụ rồi làm mất một phần sản phẩm.</w:t>
       </w:r>
     </w:p>
     <w:p>
@@ -4082,7 +4082,7 @@
           <wp:inline>
             <wp:extent cx="5313713" cy="3960000"/>
             <wp:effectExtent b="0" l="0" r="0" t="0"/>
-            <wp:docPr descr="Hình 5. Khu vực danh sách hoàn thiện trên1366 px: bốn sản phẩm, lưới bốn cột, bộ lọc/đặt lại được giữ và các thẻ có thông tin giá/thao tác." title="" id="43" name="Picture"/>
+            <wp:docPr descr="Hình 5. Khu vực danh sách hoàn thiện trên 1366 px: bốn sản phẩm, lưới bốn cột, bộ lọc/đặt lại được giữ và các thẻ có thông tin giá/thao tác." title="" id="43" name="Picture"/>
             <a:graphic>
               <a:graphicData uri="http://schemas.openxmlformats.org/drawingml/2006/picture">
                 <pic:pic>
@@ -4130,7 +4130,7 @@
           <w:i/>
           <w:sz w:val="20"/>
         </w:rPr>
-        <w:t>Hình 5. Khu vực danh sách hoàn thiện trên1366 px: bốn sản phẩm, lưới bốn cột, bộ lọc/đặt lại được giữ và các thẻ có thông tin giá/thao tác.</w:t>
+        <w:t>Hình 5. Khu vực danh sách hoàn thiện trên 1366 px: bốn sản phẩm, lưới bốn cột, bộ lọc/đặt lại được giữ và các thẻ có thông tin giá/thao tác.</w:t>
       </w:r>
     </w:p>
     <w:bookmarkEnd w:id="45"/>
@@ -4148,7 +4148,7 @@
         <w:pStyle w:val="FirstParagraph"/>
       </w:pPr>
       <w:r>
-        <w:t xml:space="preserve">Thao tác dùng nền trắng/chữ xanh; hover chuyển nền xanh/chữ trắng. Transition màu180 ms tạo phản hồi nhẹ; không đổi padding/viền dày hoặc kích thước nên chiều cao vẫn48 px. Focus-visible có outline solid3 px, offset3 px để nhận biết khi dùng bàn phím. Hover là con trỏ ở trên phần tử; focus là phần tử nhận thao tác bàn phím, không được coi hai trạng thái là một.</w:t>
+        <w:t xml:space="preserve">Thao tác dùng nền trắng/chữ xanh; hover chuyển nền xanh/chữ trắng. Transition màu 180 ms tạo phản hồi nhẹ; không đổi padding/viền dày hoặc kích thước nên chiều cao vẫn 48 px. Focus-visible có outline solid 3 px, offset 3 px để nhận biết khi dùng bàn phím. Hover là con trỏ ở trên phần tử; focus là phần tử nhận thao tác bàn phím, không được coi hai trạng thái là một.</w:t>
       </w:r>
     </w:p>
     <w:p>
@@ -4750,12 +4750,12 @@
         <w:pStyle w:val="BodyText"/>
       </w:pPr>
       <w:r>
-        <w:t xml:space="preserve">Quy tắc prefers-reduced-motion kế thừa có hiệu lực: khi reduce, transition trở về0s. Nhãn đầy đủ trong summary phân biệt sản phẩm; Enter mở/đóng thông tin, không mô phỏng thêm giỏ hoặc mua hàng.</w:t>
+        <w:t xml:space="preserve">Quy tắc prefers-reduced-motion kế thừa có hiệu lực: khi reduce, transition trở về 0 s. Nhãn đầy đủ trong summary phân biệt sản phẩm; Enter mở/đóng thông tin, không mô phỏng thêm giỏ hoặc mua hàng.</w:t>
       </w:r>
     </w:p>
     <w:bookmarkEnd w:id="52"/>
     <w:bookmarkEnd w:id="53"/>
-    <w:bookmarkStart w:id="61" w:name="X5672de1443d23ff7b021e75ef46ef5121c916c1"/>
+    <w:bookmarkStart w:id="62" w:name="X5672de1443d23ff7b021e75ef46ef5121c916c1"/>
     <w:p>
       <w:pPr>
         <w:pStyle w:val="Heading1"/>
@@ -4779,7 +4779,7 @@
         <w:pStyle w:val="FirstParagraph"/>
       </w:pPr>
       <w:r>
-        <w:t xml:space="preserve">Chromium154.0.8037.57, Playwright, html5lib1.1 và axe-core4.10.3 kiểm tra trang qua HTTP từ checkout. Công cụ chỉ dùng trong quá trình đo, không tải vào website. Các thí nghiệm thay CSS/alt chỉ tồn tại trong DOM trình duyệt và được khôi phục; không cộng các biến thể thử vào mã cuối.</w:t>
+        <w:t xml:space="preserve">Chromium 154.0.8037.57, Playwright, html5lib 1.1 và axe-core 4.10.3 kiểm tra trang qua HTTP từ checkout. Công cụ chỉ dùng trong quá trình đo, không tải vào website. Các thí nghiệm thay CSS/alt chỉ tồn tại trong DOM trình duyệt và được khôi phục; không cộng các biến thể thử vào mã cuối.</w:t>
       </w:r>
     </w:p>
     <w:p>
@@ -4787,7 +4787,7 @@
         <w:pStyle w:val="BodyText"/>
       </w:pPr>
       <w:r>
-        <w:t xml:space="preserve">Ba chiều rộng đề gợi ý1366/768/390 px đều được kiểm tra; thêm1440/1024/375/320 px. Log có thời điểmUTC, số đo, trạng thái, lỗi và SHA-256 bốn tệp nguồn; ảnh cuối được chụp với con trỏ ngoài nút để tránh nhầm hover.</w:t>
+        <w:t xml:space="preserve">Ba chiều rộng đề gợi ý 1366/768/390 px đều được kiểm tra; thêm 1440/1024/375/320 px. Log có thời điểmUTC, số đo, trạng thái, lỗi và SHA-256 bốn tệp nguồn; ảnh cuối được chụp với con trỏ ngoài nút để tránh nhầm hover.</w:t>
       </w:r>
     </w:p>
     <w:bookmarkEnd w:id="54"/>
@@ -4928,7 +4928,7 @@
                 <w:rFonts w:ascii="Times New Roman" w:hAnsi="Times New Roman"/>
                 <w:sz w:val="20"/>
               </w:rPr>
-              <w:t xml:space="preserve">HTTP200, đúng nội dung và bốn sản phẩm.</w:t>
+              <w:t xml:space="preserve">HTTP 200, đúng nội dung và bốn sản phẩm.</w:t>
             </w:r>
           </w:p>
         </w:tc>
@@ -5040,7 +5040,7 @@
                 <w:rFonts w:ascii="Times New Roman" w:hAnsi="Times New Roman"/>
                 <w:sz w:val="20"/>
               </w:rPr>
-              <w:t xml:space="preserve">Bốn ảnh có alt, tải đủ640×480, tỷ lệ4/3 không méo.</w:t>
+              <w:t xml:space="preserve">Bốn ảnh có alt, tải đủ 640 × 480, tỷ lệ 4/3 không méo.</w:t>
             </w:r>
           </w:p>
         </w:tc>
@@ -5208,7 +5208,7 @@
                 <w:rFonts w:ascii="Times New Roman" w:hAnsi="Times New Roman"/>
                 <w:sz w:val="20"/>
               </w:rPr>
-              <w:t xml:space="preserve">Chuyển màu, focus3 px, chiều cao48 px không đổi.</w:t>
+              <w:t xml:space="preserve">Chuyển màu, focus 3 px, chiều cao 48 px không đổi.</w:t>
             </w:r>
           </w:p>
         </w:tc>
@@ -5410,7 +5410,7 @@
                 <w:rFonts w:ascii="Times New Roman" w:hAnsi="Times New Roman"/>
                 <w:sz w:val="20"/>
               </w:rPr>
-              <w:t xml:space="preserve">21/21 đúng nhóm/số lượng2/1/1; cả li và article hiển thị đúng.</w:t>
+              <w:t xml:space="preserve">21/21 đúng nhóm/số lượng 2/1/1; cả li và article hiển thị đúng.</w:t>
             </w:r>
           </w:p>
         </w:tc>
@@ -5683,7 +5683,7 @@
                 <w:rFonts w:ascii="Times New Roman" w:hAnsi="Times New Roman"/>
                 <w:sz w:val="20"/>
               </w:rPr>
-              <w:t xml:space="preserve">Hiển thị khớp products.json, tỷ lệ20/20/15/20% đúng.</w:t>
+              <w:t xml:space="preserve">Hiển thị khớp products.json, tỷ lệ 20/20/15/20% đúng.</w:t>
             </w:r>
           </w:p>
         </w:tc>
@@ -5722,7 +5722,7 @@
                 <w:rFonts w:ascii="Times New Roman" w:hAnsi="Times New Roman"/>
                 <w:sz w:val="20"/>
               </w:rPr>
-              <w:t xml:space="preserve">Không pageerror/HTTP lỗi; 0 script ứng dụng trước khi chèn công cụ đo.</w:t>
+              <w:t xml:space="preserve">Không có lỗi JavaScript hoặc phản hồi HTTP lỗi; 0 script ứng dụng trước khi chèn công cụ đo.</w:t>
             </w:r>
           </w:p>
         </w:tc>
@@ -5785,11 +5785,11 @@
         <w:t xml:space="preserve">12,09:1</w:t>
       </w:r>
       <w:r>
-        <w:t xml:space="preserve">, vượt4,5:1. Đây là kiểm tra bổ sung các ký hiệu; không phải chứng nhận WCAG. Chưa kiểm tra mọi Safari/Firefox, thiết bị thật, trình đọc màn hình hoặc hiệu quả người mua; thông báo aria-live khi đổi hiển thị bằng CSS chưa được xác minh trên từng công nghệ hỗ trợ.</w:t>
+        <w:t xml:space="preserve">, vượt 4,5:1. Đây là kiểm tra bổ sung các ký hiệu; không phải chứng nhận WCAG. Chưa kiểm tra mọi Safari/Firefox, thiết bị thật, trình đọc màn hình hoặc hiệu quả người mua; thông báo aria-live khi đổi hiển thị bằng CSS chưa được xác minh trên từng công nghệ hỗ trợ.</w:t>
       </w:r>
     </w:p>
     <w:bookmarkEnd w:id="56"/>
-    <w:bookmarkStart w:id="60" w:name="Xa03eb197163d4d3ff7ad5cd0b3ca43eebdc89a1"/>
+    <w:bookmarkStart w:id="57" w:name="Xa03eb197163d4d3ff7ad5cd0b3ca43eebdc89a1"/>
     <w:p>
       <w:pPr>
         <w:pStyle w:val="Heading2"/>
@@ -5803,7 +5803,7 @@
         <w:pStyle w:val="FirstParagraph"/>
       </w:pPr>
       <w:r>
-        <w:t xml:space="preserve">Vấn đề đã xác nhận là các min-height cùng selector ở cuối file ghi đè giá trị trong media trước. Cách sửa là bỏ các chiều cao tối thiểu cạnh tranh, tổ chức quy tắc gốc trước media và dùng Flexbox cột/margin-top:auto. Ở768 px, mô tả cuối khoảng47,59 px theo nội dung; thẻ đầu đo604,17 px so với622,06 px trước. Đây là số đo bố cục của một thẻ, không suy thành mức tăng hiệu quả mua sắm.</w:t>
+        <w:t xml:space="preserve">Vấn đề đã xác nhận là các min-height cùng selector ở cuối file ghi đè giá trị trong media trước. Cách sửa là bỏ các chiều cao tối thiểu cạnh tranh, tổ chức quy tắc gốc trước media và dùng Flexbox cột/margin-top:auto. Ở 768 px, mô tả cuối khoảng 47,59 px theo nội dung; thẻ đầu đo 604,17 px so với 622,06 px trước. Đây là số đo bố cục của một thẻ, không suy thành mức tăng hiệu quả mua sắm.</w:t>
       </w:r>
     </w:p>
     <w:p>
@@ -5812,6 +5812,32 @@
       </w:pPr>
       <w:r>
         <w:t xml:space="preserve">Việc bổ sung danh sách và transition là cải thiện có chủ đích, không biến thành lời kết luận rằng HTML cũ sai hoặc không có focus. Sau khi đổi HTML, đã kiểm tra lọc trên li để giữ hành vi cũ. Bảng và ảnh minh chứng ở evidence/buoi2, kiểm tra tái chạy tùy chọn trong tools/README.md.</w:t>
+      </w:r>
+    </w:p>
+    <w:bookmarkEnd w:id="57"/>
+    <w:bookmarkStart w:id="61" w:name="X6e0c29f7957d3ddaced08b17db4e887c2f5eb11"/>
+    <w:p>
+      <w:pPr>
+        <w:pStyle w:val="Heading2"/>
+      </w:pPr>
+      <w:r>
+        <w:t xml:space="preserve">4.5. Đính chính và kiểm chứng ở lượt rà soát cuối</w:t>
+      </w:r>
+    </w:p>
+    <w:p>
+      <w:pPr>
+        <w:pStyle w:val="FirstParagraph"/>
+      </w:pPr>
+      <w:r>
+        <w:t xml:space="preserve">Lượt rà soát cuối bổ sung 14 chiều rộng, gồm các mốc sát 580/581 px và 1100/1101 px, kiểm tra cả trạng thái đóng và mở thông tin. Không phát hiện tràn ngang hoặc lỗi chức năng trong phạm vi đã đo. Bộ kiểm thử cơ sở gồm 21 tình huống được chạy lại; bổ sung đối chiếu đầy đủ giá bán, giá cũ, tiền tiết kiệm, tỷ lệ hiển thị và axe khi mở tất cả thông tin. Log mới ở evidence/buoi2/final-review, vẫn phân biệt phạm vi đã thử với thiết bị/trình đọc màn hình chưa kiểm chứng.</w:t>
+      </w:r>
+    </w:p>
+    <w:p>
+      <w:pPr>
+        <w:pStyle w:val="BodyText"/>
+      </w:pPr>
+      <w:r>
+        <w:t xml:space="preserve">Đã sửa một nhận định chưa đủ chính xác trong hướng dẫn Box Model: tăng padding 24→28 px vẫn giữ khung ngoài 300 px trong bố cục width:auto còn do Flexbox kéo giãn theo trục ngang, không chỉ do border-box. Thử riêng width:100%/padding 28 px cho kết quả border-box 300 px và content-box 356 px. Các đáp án/hướng dẫn sửa trực tiếp đã cập nhật theo phép đo; không lưu cấu hình thử vào trang. Đồng thời chuẩn hóa khoảng trắng của phần diễn giải, giữ nguyên mã nguồn minh họa và nội dung trích dẫn.</w:t>
       </w:r>
     </w:p>
     <w:p>
@@ -5825,18 +5851,18 @@
           <wp:inline>
             <wp:extent cx="2290588" cy="3960000"/>
             <wp:effectExtent b="0" l="0" r="0" t="0"/>
-            <wp:docPr descr="Hình 8. Thẻ trên390 px sau hoàn thiện: padding20 px, ảnh đúng tỷ lệ, nội dung và thao tác không tràn ngang. Ảnh toàn danh sách điện thoại có trong gói." title="" id="58" name="Picture"/>
+            <wp:docPr descr="Hình 8. Thẻ trên 390 px sau hoàn thiện: padding 20 px, ảnh đúng tỷ lệ, nội dung và thao tác không tràn ngang. Ảnh toàn danh sách điện thoại có trong gói." title="" id="59" name="Picture"/>
             <a:graphic>
               <a:graphicData uri="http://schemas.openxmlformats.org/drawingml/2006/picture">
                 <pic:pic>
                   <pic:nvPicPr>
-                    <pic:cNvPr descr="ma-nguon/evidence/buoi2/after/card-390.png" id="59" name="Picture"/>
+                    <pic:cNvPr descr="ma-nguon/evidence/buoi2/after/card-390.png" id="60" name="Picture"/>
                     <pic:cNvPicPr>
                       <a:picLocks noChangeArrowheads="1" noChangeAspect="1"/>
                     </pic:cNvPicPr>
                   </pic:nvPicPr>
                   <pic:blipFill>
-                    <a:blip r:embed="rId57"/>
+                    <a:blip r:embed="rId58"/>
                     <a:stretch>
                       <a:fillRect/>
                     </a:stretch>
@@ -5873,7 +5899,7 @@
           <w:i/>
           <w:sz w:val="20"/>
         </w:rPr>
-        <w:t>Hình 8. Thẻ trên390 px sau hoàn thiện: padding20 px, ảnh đúng tỷ lệ, nội dung và thao tác không tràn ngang. Ảnh toàn danh sách điện thoại có trong gói.</w:t>
+        <w:t>Hình 8. Thẻ trên 390 px sau hoàn thiện: padding 20 px, ảnh đúng tỷ lệ, nội dung và thao tác không tràn ngang. Ảnh toàn danh sách điện thoại có trong gói.</w:t>
       </w:r>
     </w:p>
     <w:p>
@@ -5884,9 +5910,9 @@
         <w:t xml:space="preserve">Phần tự mở, tự phát hiện/sửa và giải thích của sinh viên chưa được xác nhận thay. Phiếu cuối báo cáo/TU_KIEM_TRA.md dùng ghi kết quả cá nhân; không đổi người thực hiện của các log đã có.</w:t>
       </w:r>
     </w:p>
-    <w:bookmarkEnd w:id="60"/>
     <w:bookmarkEnd w:id="61"/>
-    <w:bookmarkStart w:id="73" w:name="X87945d10ba74f6d47bb002871a1fb2e7acacbca"/>
+    <w:bookmarkEnd w:id="62"/>
+    <w:bookmarkStart w:id="74" w:name="X87945d10ba74f6d47bb002871a1fb2e7acacbca"/>
     <w:p>
       <w:pPr>
         <w:pStyle w:val="Heading1"/>
@@ -5896,7 +5922,7 @@
         <w:t xml:space="preserve">5. Trả lời câu hỏi kiến thức từ mã thật</w:t>
       </w:r>
     </w:p>
-    <w:bookmarkStart w:id="69" w:name="X9de678188488bd7f5ca537d518bf116eb8fa03d"/>
+    <w:bookmarkStart w:id="70" w:name="X9de678188488bd7f5ca537d518bf116eb8fa03d"/>
     <w:p>
       <w:pPr>
         <w:pStyle w:val="Heading2"/>
@@ -5905,7 +5931,7 @@
         <w:t xml:space="preserve">5.1. Bảy câu hỏi chính — mục 12 của đề</w:t>
       </w:r>
     </w:p>
-    <w:bookmarkStart w:id="62" w:name="X7338f6533d43d87dc96d359d750e4fca69312c4"/>
+    <w:bookmarkStart w:id="63" w:name="X7338f6533d43d87dc96d359d750e4fca69312c4"/>
     <w:p>
       <w:pPr>
         <w:pStyle w:val="Heading3"/>
@@ -6532,8 +6558,8 @@
         <w:t xml:space="preserve">vẫn dùng div.</w:t>
       </w:r>
     </w:p>
-    <w:bookmarkEnd w:id="62"/>
-    <w:bookmarkStart w:id="63" w:name="Xfee27aec191a23e89a646b62ec6b9198ce98c20"/>
+    <w:bookmarkEnd w:id="63"/>
+    <w:bookmarkStart w:id="64" w:name="Xfee27aec191a23e89a646b62ec6b9198ce98c20"/>
     <w:p>
       <w:pPr>
         <w:pStyle w:val="Heading3"/>
@@ -6635,7 +6661,7 @@
         <w:t xml:space="preserve"> </w:t>
       </w:r>
       <w:r>
-        <w:t xml:space="preserve">đặt margin:0; khoảng cách giữa các thẻ do Grid gap:24 px quản lý, tránh cộng dồn khoảng cách.</w:t>
+        <w:t xml:space="preserve">đặt margin:0; khoảng cách giữa các thẻ do Grid gap:24px quản lý, tránh cộng dồn khoảng cách.</w:t>
       </w:r>
     </w:p>
     <w:p>
@@ -6653,7 +6679,7 @@
         <w:t xml:space="preserve"> </w:t>
       </w:r>
       <w:r>
-        <w:t xml:space="preserve">là viền: article có border:1 px solid và border-radius:18 px.</w:t>
+        <w:t xml:space="preserve">là viền: article có border:1px solid và border-radius:18px.</w:t>
       </w:r>
       <w:r>
         <w:t xml:space="preserve"> </w:t>
@@ -6723,8 +6749,31 @@
         <w:t xml:space="preserve">.</w:t>
       </w:r>
     </w:p>
-    <w:bookmarkEnd w:id="63"/>
-    <w:bookmarkStart w:id="64" w:name="X42c275a2d3ebd1e91288b85c40173535ea578ff"/>
+    <w:p>
+      <w:pPr>
+        <w:pStyle w:val="BodyText"/>
+      </w:pPr>
+      <w:r>
+        <w:t xml:space="preserve">Cần phân biệt cơ chế tính kích thước: trong bố cục này</w:t>
+      </w:r>
+      <w:r>
+        <w:t xml:space="preserve"> </w:t>
+      </w:r>
+      <w:r>
+        <w:rPr>
+          <w:rStyle w:val="VerbatimChar"/>
+        </w:rPr>
+        <w:t xml:space="preserve">.product-content</w:t>
+      </w:r>
+      <w:r>
+        <w:t xml:space="preserve"> </w:t>
+      </w:r>
+      <w:r>
+        <w:t xml:space="preserve">có width:auto và được Flexbox kéo giãn theo trục ngang, nên tăng padding 24→28 px vẫn giữ khung ngoài 300 px cả khi thử content-box. Khi thử riêng width:100% và padding 28 px, border-box giữ 300 px còn content-box thành 356 px. Vì vậy không dùng hiện tượng width:auto để kết luận rằng chỉ border-box mới giữ được chiều rộng ngoài.</w:t>
+      </w:r>
+    </w:p>
+    <w:bookmarkEnd w:id="64"/>
+    <w:bookmarkStart w:id="65" w:name="X42c275a2d3ebd1e91288b85c40173535ea578ff"/>
     <w:p>
       <w:pPr>
         <w:pStyle w:val="Heading3"/>
@@ -7186,8 +7235,8 @@
         <w:t xml:space="preserve">nhận phần trống còn lại để căn khối giá, thay cách đặt min-height cố định cho nhiều đoạn.</w:t>
       </w:r>
     </w:p>
-    <w:bookmarkEnd w:id="64"/>
-    <w:bookmarkStart w:id="65" w:name="X1ad5e7813b1976b9d153864ae2dc721e7fd2a72"/>
+    <w:bookmarkEnd w:id="65"/>
+    <w:bookmarkStart w:id="66" w:name="X1ad5e7813b1976b9d153864ae2dc721e7fd2a72"/>
     <w:p>
       <w:pPr>
         <w:pStyle w:val="Heading3"/>
@@ -7304,8 +7353,8 @@
         <w:t xml:space="preserve">cho cột co lại trong vùng chứa. Gap tạo rãnh giữa hàng/cột.</w:t>
       </w:r>
     </w:p>
-    <w:bookmarkEnd w:id="65"/>
-    <w:bookmarkStart w:id="66" w:name="câu-5-nếu-xóa-displaygrid"/>
+    <w:bookmarkEnd w:id="66"/>
+    <w:bookmarkStart w:id="67" w:name="câu-5-nếu-xóa-displaygrid"/>
     <w:p>
       <w:pPr>
         <w:pStyle w:val="Heading3"/>
@@ -7345,8 +7394,8 @@
         <w:t xml:space="preserve">Đã thử bằng cách tạm đổi display:block trên chính ul. Hai mục đầu có cùng tọa độ trái và mục thứ hai nằm phía dưới mục thứ nhất. Đây là quan sát trong trình duyệt, không phải cấu hình cuối được lưu.</w:t>
       </w:r>
     </w:p>
-    <w:bookmarkEnd w:id="66"/>
-    <w:bookmarkStart w:id="67" w:name="câu-6-vì-sao-ảnh-cần-alt"/>
+    <w:bookmarkEnd w:id="67"/>
+    <w:bookmarkStart w:id="68" w:name="câu-6-vì-sao-ảnh-cần-alt"/>
     <w:p>
       <w:pPr>
         <w:pStyle w:val="Heading3"/>
@@ -7371,8 +7420,8 @@
         <w:t xml:space="preserve">Alt không thay thế việc kiểm tra đường dẫn src. Hình thuần trang trí có thể dùng alt rỗng phù hợp, nhưng bốn hình sản phẩm mang thông tin nên dùng mô tả có nội dung. SVG biểu tượng trang trí trong nút được ẩn khỏi công nghệ hỗ trợ bằng aria-hidden.</w:t>
       </w:r>
     </w:p>
-    <w:bookmarkEnd w:id="67"/>
-    <w:bookmarkStart w:id="68" w:name="X06d5d3a039af09ea9ae422f1b8dd2fa3864a00f"/>
+    <w:bookmarkEnd w:id="68"/>
+    <w:bookmarkStart w:id="69" w:name="X06d5d3a039af09ea9ae422f1b8dd2fa3864a00f"/>
     <w:p>
       <w:pPr>
         <w:pStyle w:val="Heading3"/>
@@ -7456,9 +7505,9 @@
         <w:t xml:space="preserve">; số mục hiển thị và thẻ cùng đúng 2/1/1. Đây là kiểm chứng do trợ lý thực hiện. Sinh viên có thể dùng ví dụ này sau khi tự đọc, thao tác và giải thích; không khai rằng đã tự thực hiện nếu chưa làm.</w:t>
       </w:r>
     </w:p>
-    <w:bookmarkEnd w:id="68"/>
     <w:bookmarkEnd w:id="69"/>
-    <w:bookmarkStart w:id="70" w:name="Xda3f1f8c797829d8152b9fb9b03b3ea76eda511"/>
+    <w:bookmarkEnd w:id="70"/>
+    <w:bookmarkStart w:id="71" w:name="Xda3f1f8c797829d8152b9fb9b03b3ea76eda511"/>
     <w:p>
       <w:pPr>
         <w:pStyle w:val="Heading2"/>
@@ -7555,8 +7604,8 @@
         <w:t xml:space="preserve">Khi nội dung là tập các mục không có thứ tự bắt buộc: sản phẩm, menu, đặc điểm. Khi trình tự có ý nghĩa có thể dùng ol/li như ba ý trong khu vực giới thiệu.</w:t>
       </w:r>
     </w:p>
-    <w:bookmarkEnd w:id="70"/>
-    <w:bookmarkStart w:id="71" w:name="Xc67b9a6cb245bbf0ddb4c739abcc106aebf85c5"/>
+    <w:bookmarkEnd w:id="71"/>
+    <w:bookmarkStart w:id="72" w:name="Xc67b9a6cb245bbf0ddb4c739abcc106aebf85c5"/>
     <w:p>
       <w:pPr>
         <w:pStyle w:val="Heading2"/>
@@ -7631,8 +7680,8 @@
         <w:t xml:space="preserve">Gap đặt trên cha, tạo khoảng cách giữa các mục, không tạo khoảng cách ngoài mép container. Margin đặt trên từng phần tử và còn có thể tạo khoảng cách phía ngoài; trong thẻ có margin của đoạn mô tả. Không cộng margin vào li chỉ để lặp lại gap đã có.</w:t>
       </w:r>
     </w:p>
-    <w:bookmarkEnd w:id="71"/>
-    <w:bookmarkStart w:id="72" w:name="X042844cc0fbf258ad3c3ed9f399daa52bd24280"/>
+    <w:bookmarkEnd w:id="72"/>
+    <w:bookmarkStart w:id="73" w:name="X042844cc0fbf258ad3c3ed9f399daa52bd24280"/>
     <w:p>
       <w:pPr>
         <w:pStyle w:val="Heading2"/>
@@ -7670,12 +7719,12 @@
         <w:t xml:space="preserve"> </w:t>
       </w:r>
       <w:r>
-        <w:t xml:space="preserve">với tỷ lệ 4/3 để hiển thị trọn hình minh họa 640×480. Việc chọn contain có lý do theo tài sản thực tế, không chép cover trong ví dụ rồi để sản phẩm bị cắt.</w:t>
-      </w:r>
-    </w:p>
-    <w:bookmarkEnd w:id="72"/>
+        <w:t xml:space="preserve">với tỷ lệ 4/3 để hiển thị trọn hình minh họa 640 × 480. Việc chọn contain có lý do theo tài sản thực tế, không chép cover trong ví dụ rồi để sản phẩm bị cắt.</w:t>
+      </w:r>
+    </w:p>
     <w:bookmarkEnd w:id="73"/>
-    <w:bookmarkStart w:id="80" w:name="X329423b6e0758a78aaebbad4a174b7249c15bf3"/>
+    <w:bookmarkEnd w:id="74"/>
+    <w:bookmarkStart w:id="81" w:name="X329423b6e0758a78aaebbad4a174b7249c15bf3"/>
     <w:p>
       <w:pPr>
         <w:pStyle w:val="Heading1"/>
@@ -7751,7 +7800,7 @@
         <w:t xml:space="preserve">đã do trợ lý chạy trên DOM/CSS của trình duyệt; sinh viên cần tự luyện trong editor.</w:t>
       </w:r>
     </w:p>
-    <w:bookmarkStart w:id="74" w:name="Xa17518bc984b04cb03ebdd3e6039ec8913dea7f"/>
+    <w:bookmarkStart w:id="75" w:name="Xa17518bc984b04cb03ebdd3e6039ec8913dea7f"/>
     <w:p>
       <w:pPr>
         <w:pStyle w:val="Heading2"/>
@@ -7789,7 +7838,34 @@
         <w:t xml:space="preserve">padding:28px</w:t>
       </w:r>
       <w:r>
-        <w:t xml:space="preserve">. Tại 1366 px, khung rộng ngoài vẫn giữ 300 px do border-box; vùng nội dung giảm từ 252 xuống 244 px. Ở màn hình ≤580 px còn quy tắc padding:20 px phía sau: nếu muốn thay riêng điện thoại phải sửa quy tắc media đó, tránh tưởng CSS không áp dụng.</w:t>
+        <w:t xml:space="preserve">. Tại 1366 px, vùng nội dung giảm từ 252 xuống 244 px, còn khung rộng ngoài vẫn 300 px. Trong bố cục hiện tại, phần tử có</w:t>
+      </w:r>
+      <w:r>
+        <w:t xml:space="preserve"> </w:t>
+      </w:r>
+      <w:r>
+        <w:rPr>
+          <w:rStyle w:val="VerbatimChar"/>
+        </w:rPr>
+        <w:t xml:space="preserve">width:auto</w:t>
+      </w:r>
+      <w:r>
+        <w:t xml:space="preserve"> </w:t>
+      </w:r>
+      <w:r>
+        <w:t xml:space="preserve">và được Flexbox kéo giãn theo chiều ngang; không quy việc giữ chiều rộng ngoài chỉ cho</w:t>
+      </w:r>
+      <w:r>
+        <w:t xml:space="preserve"> </w:t>
+      </w:r>
+      <w:r>
+        <w:rPr>
+          <w:rStyle w:val="VerbatimChar"/>
+        </w:rPr>
+        <w:t xml:space="preserve">border-box</w:t>
+      </w:r>
+      <w:r>
+        <w:t xml:space="preserve">. Ở màn hình ≤580 px còn quy tắc padding:20px phía sau: nếu muốn thay riêng điện thoại phải sửa quy tắc media đó, tránh tưởng CSS không áp dụng.</w:t>
       </w:r>
     </w:p>
     <w:p>
@@ -7797,11 +7873,34 @@
         <w:pStyle w:val="BodyText"/>
       </w:pPr>
       <w:r>
+        <w:t xml:space="preserve">Để phân biệt hai cơ chế, đã thử riêng</w:t>
+      </w:r>
+      <w:r>
+        <w:t xml:space="preserve"> </w:t>
+      </w:r>
+      <w:r>
+        <w:rPr>
+          <w:rStyle w:val="VerbatimChar"/>
+        </w:rPr>
+        <w:t xml:space="preserve">width:100%</w:t>
+      </w:r>
+      <w:r>
+        <w:t xml:space="preserve"> </w:t>
+      </w:r>
+      <w:r>
+        <w:t xml:space="preserve">với padding 28 px: border-box cho chiều rộng ngoài 300 px; content-box cho 356 px vì cộng thêm 56 px padding. Đây là thí nghiệm tạm, không phải cấu hình lưu trong trang.</w:t>
+      </w:r>
+    </w:p>
+    <w:p>
+      <w:pPr>
+        <w:pStyle w:val="BodyText"/>
+      </w:pPr>
+      <w:r>
         <w:t xml:space="preserve">Kiểm tra: chữ cách mép nhiều hơn, ảnh vẫn sát viền vì padding ở vùng nội dung; không xuất hiện cuộn ngang. Hoàn nguyên về 24 px sau thử nếu không chọn làm thay đổi cuối.</w:t>
       </w:r>
     </w:p>
-    <w:bookmarkEnd w:id="74"/>
-    <w:bookmarkStart w:id="75" w:name="Xb6cd0d6d9944ce7d6b21ad5785f23a77cc1597b"/>
+    <w:bookmarkEnd w:id="75"/>
+    <w:bookmarkStart w:id="76" w:name="Xb6cd0d6d9944ce7d6b21ad5785f23a77cc1597b"/>
     <w:p>
       <w:pPr>
         <w:pStyle w:val="Heading2"/>
@@ -7857,8 +7956,8 @@
         <w:t xml:space="preserve">. Kết quả dự kiến chỉ giá hiện tại đổi sang đỏ đậm; giá cũ và mô tả không đổi. Kiểm tra màu trong Computed và độ tương phản trên nền trắng. Đã thử và đọc được rgb(179,49,38). Cấu hình cuối vẫn dùng xanh đậm kế thừa từ trang.</w:t>
       </w:r>
     </w:p>
-    <w:bookmarkEnd w:id="75"/>
-    <w:bookmarkStart w:id="76" w:name="Xb6f02531111b1148419ea69fa426782400b3dfb"/>
+    <w:bookmarkEnd w:id="76"/>
+    <w:bookmarkStart w:id="77" w:name="Xb6f02531111b1148419ea69fa426782400b3dfb"/>
     <w:p>
       <w:pPr>
         <w:pStyle w:val="Heading2"/>
@@ -7986,8 +8085,8 @@
         <w:t xml:space="preserve">Không xóa display:grid khi chỉ muốn đổi số cột. Cấu hình cuối là 4/2/1; ảnh thử hai và ba cột được ghi riêng.</w:t>
       </w:r>
     </w:p>
-    <w:bookmarkEnd w:id="76"/>
-    <w:bookmarkStart w:id="77" w:name="X5eeac13d1f5acb7dd92c4ead1f3141d5a6c6a1b"/>
+    <w:bookmarkEnd w:id="77"/>
+    <w:bookmarkStart w:id="78" w:name="X5eeac13d1f5acb7dd92c4ead1f3141d5a6c6a1b"/>
     <w:p>
       <w:pPr>
         <w:pStyle w:val="Heading2"/>
@@ -8061,8 +8160,8 @@
         <w:t xml:space="preserve">là vùng nav bao ngoài. Kiểm tra các liên kết tách xa hơn và vẫn xuống dòng khi cần. Quy tắc cho màn hình nhỏ có thể ghi đè gap; kiểm tra đúng viewport.</w:t>
       </w:r>
     </w:p>
-    <w:bookmarkEnd w:id="77"/>
-    <w:bookmarkStart w:id="78" w:name="X70139f0847ea79afbcc6dae4200197a3f333d69"/>
+    <w:bookmarkEnd w:id="78"/>
+    <w:bookmarkStart w:id="79" w:name="X70139f0847ea79afbcc6dae4200197a3f333d69"/>
     <w:p>
       <w:pPr>
         <w:pStyle w:val="Heading2"/>
@@ -8079,8 +8178,8 @@
         <w:t xml:space="preserve">Trong img đầu tiên, đổi alt thành một mô tả đúng hình, ví dụ “Bàn phím cơ K75 mẫu, phím màu kem và xanh”. Giữ nguyên src. Kiểm tra trong DOM rằng alt đã đổi; giao diện nhìn thấy có thể không đổi vì ảnh vẫn tải bình thường. Không tạo alt bằng giá bán hoặc thông tin không có trong hình.</w:t>
       </w:r>
     </w:p>
-    <w:bookmarkEnd w:id="78"/>
-    <w:bookmarkStart w:id="79" w:name="Xd29e18dc73f6313c82006bde687d9afb607dda9"/>
+    <w:bookmarkEnd w:id="79"/>
+    <w:bookmarkStart w:id="80" w:name="Xd29e18dc73f6313c82006bde687d9afb607dda9"/>
     <w:p>
       <w:pPr>
         <w:pStyle w:val="Heading2"/>
@@ -8149,9 +8248,9 @@
         <w:t xml:space="preserve">Ghi thay đổi cá nhân và bằng chứng vào TU_KIEM_TRA.md; commit nếu giữ làm bản chính.</w:t>
       </w:r>
     </w:p>
-    <w:bookmarkEnd w:id="79"/>
     <w:bookmarkEnd w:id="80"/>
-    <w:bookmarkStart w:id="92" w:name="X198f07a08fda6c7dc3e79deb24f6bf38354d87f"/>
+    <w:bookmarkEnd w:id="81"/>
+    <w:bookmarkStart w:id="93" w:name="X198f07a08fda6c7dc3e79deb24f6bf38354d87f"/>
     <w:p>
       <w:pPr>
         <w:pStyle w:val="Heading1"/>
@@ -8161,7 +8260,7 @@
         <w:t xml:space="preserve">7. Báo cáo sử dụng AI và chín khung prompt</w:t>
       </w:r>
     </w:p>
-    <w:bookmarkStart w:id="81" w:name="Xc5623b8eb23165859f1cf706cddb7559fff9a2b"/>
+    <w:bookmarkStart w:id="82" w:name="Xc5623b8eb23165859f1cf706cddb7559fff9a2b"/>
     <w:p>
       <w:pPr>
         <w:pStyle w:val="Heading2"/>
@@ -8186,8 +8285,8 @@
         <w:t xml:space="preserve">Chín khung dưới được trợ lý áp dụng theo đề trong phiên làm việc; không trình bày thành chín tin nhắn độc lập do sinh viên gửi, không tạo ảnh hội thoại giả. Mã đầu vào/đầu ra đối chiếu qua lịch sử Git; log đầy đủ trong docs/buoi2/AI_USAGE.md.</w:t>
       </w:r>
     </w:p>
-    <w:bookmarkEnd w:id="81"/>
-    <w:bookmarkStart w:id="82" w:name="prompt-1--phân-tích-mã-hiện-tại"/>
+    <w:bookmarkEnd w:id="82"/>
+    <w:bookmarkStart w:id="83" w:name="prompt-1--phân-tích-mã-hiện-tại"/>
     <w:p>
       <w:pPr>
         <w:pStyle w:val="Heading2"/>
@@ -8209,11 +8308,11 @@
         <w:pStyle w:val="FirstParagraph"/>
       </w:pPr>
       <w:r>
-        <w:t xml:space="preserve">Kết quả: đã có HTML ngữ nghĩa, alt, Grid, Flexbox và responsive. Xác nhận min-height cuối CSS ghi đè giá trị của media tại 768 px; đề xuất ul/li cho tập sản phẩm/menu và transition cho nền summary vốn 0s. Không gán lỗi “thiếu alt/thiếu header/chưa responsive” cho bài cũ.</w:t>
-      </w:r>
-    </w:p>
-    <w:bookmarkEnd w:id="82"/>
-    <w:bookmarkStart w:id="83" w:name="prompt-2--kiểm-tra-html5"/>
+        <w:t xml:space="preserve">Kết quả: đã có HTML ngữ nghĩa, alt, Grid, Flexbox và responsive. Xác nhận min-height cuối CSS ghi đè giá trị của media tại 768 px; đề xuất ul/li cho tập sản phẩm/menu và transition cho nền summary vốn 0 s. Không gán lỗi “thiếu alt/thiếu header/chưa responsive” cho bài cũ.</w:t>
+      </w:r>
+    </w:p>
+    <w:bookmarkEnd w:id="83"/>
+    <w:bookmarkStart w:id="84" w:name="prompt-2--kiểm-tra-html5"/>
     <w:p>
       <w:pPr>
         <w:pStyle w:val="Heading2"/>
@@ -8238,8 +8337,8 @@
         <w:t xml:space="preserve">Kết quả: sản phẩm thành ul &gt; li &gt; article; menu thành nav &gt; ul &gt; li &gt; a; có class rõ cho tên và thao tác; alt đầu tiên cụ thể hơn. Trình phân tích html5lib ghi nhận 0 lỗi phân tích; kiểm tra DOM cho một h1, không nhảy cấp/ID trùng, bốn li và ba mục menu.</w:t>
       </w:r>
     </w:p>
-    <w:bookmarkEnd w:id="83"/>
-    <w:bookmarkStart w:id="84" w:name="prompt-3--liên-kết-css-ngoài"/>
+    <w:bookmarkEnd w:id="84"/>
+    <w:bookmarkStart w:id="85" w:name="prompt-3--liên-kết-css-ngoài"/>
     <w:p>
       <w:pPr>
         <w:pStyle w:val="Heading2"/>
@@ -8264,8 +8363,8 @@
         <w:t xml:space="preserve">Kết quả: HTML tải trực tiếp css/style.css; root style.css chỉ @import để tương thích nếu dùng đường dẫn cũ. Trình duyệt xác minh stylesheet tải và có cssRules, font/màu được áp dụng; không có thư viện CSS bên ngoài.</w:t>
       </w:r>
     </w:p>
-    <w:bookmarkEnd w:id="84"/>
-    <w:bookmarkStart w:id="85" w:name="prompt-4--selector-và-box-model"/>
+    <w:bookmarkEnd w:id="85"/>
+    <w:bookmarkStart w:id="86" w:name="prompt-4--selector-và-box-model"/>
     <w:p>
       <w:pPr>
         <w:pStyle w:val="Heading2"/>
@@ -8290,8 +8389,8 @@
         <w:t xml:space="preserve">Kết quả: body/img là element selector; product-card là class selector; .product-card .product-title và .product-card .product-toggle là descendant selector. Đo tại 1366 px: thẻ 302 px, viền 1 px mỗi bên, vùng nội dung rộng ngoài 300 px, padding 24 px mỗi bên, nội dung 252 px. Tránh nhầm padding con là padding của article. Liên kết a.product-image-link được định dạng thành thao tác Xem hình lớn và thử mở đủ bốn SVG tương ứng.</w:t>
       </w:r>
     </w:p>
-    <w:bookmarkEnd w:id="85"/>
-    <w:bookmarkStart w:id="86" w:name="prompt-5--flexbox"/>
+    <w:bookmarkEnd w:id="86"/>
+    <w:bookmarkStart w:id="87" w:name="prompt-5--flexbox"/>
     <w:p>
       <w:pPr>
         <w:pStyle w:val="Heading2"/>
@@ -8313,11 +8412,11 @@
         <w:pStyle w:val="FirstParagraph"/>
       </w:pPr>
       <w:r>
-        <w:t xml:space="preserve">Kết quả: ba cấu hình được thử trên DOM; giữ space-between, align-items:center, gap:12 px. Gap tối thiểu 12 px, khoảng thực tế với space-between lớn hơn do phân phối khoảng trống. Flexbox cột trong thẻ và margin-top:auto thay min-height cứng để căn khối giá.</w:t>
-      </w:r>
-    </w:p>
-    <w:bookmarkEnd w:id="86"/>
-    <w:bookmarkStart w:id="87" w:name="prompt-6--grid"/>
+        <w:t xml:space="preserve">Kết quả: ba cấu hình được thử trên DOM; giữ space-between, align-items:center, gap:12px. Gap tối thiểu 12 px, khoảng thực tế với space-between lớn hơn do phân phối khoảng trống. Flexbox cột trong thẻ và margin-top:auto thay min-height cứng để căn khối giá.</w:t>
+      </w:r>
+    </w:p>
+    <w:bookmarkEnd w:id="87"/>
+    <w:bookmarkStart w:id="88" w:name="prompt-6--grid"/>
     <w:p>
       <w:pPr>
         <w:pStyle w:val="Heading2"/>
@@ -8342,8 +8441,8 @@
         <w:t xml:space="preserve">Kết quả: có ảnh thử hai/ba cột; cuối cùng giữ 4/2/1 theo màn hình. Dùng contain và tỷ lệ 4/3 để không cắt SVG. Thử display:block để quan sát câu hỏi khi bỏ Grid. Không gán các thí nghiệm DOM này là cấu hình chính đã lưu.</w:t>
       </w:r>
     </w:p>
-    <w:bookmarkEnd w:id="87"/>
-    <w:bookmarkStart w:id="88" w:name="prompt-7--hover-và-focus"/>
+    <w:bookmarkEnd w:id="88"/>
+    <w:bookmarkStart w:id="89" w:name="prompt-7--hover-và-focus"/>
     <w:p>
       <w:pPr>
         <w:pStyle w:val="Heading2"/>
@@ -8357,7 +8456,7 @@
         <w:pStyle w:val="BlockText"/>
       </w:pPr>
       <w:r>
-        <w:t xml:space="preserve">Bổ sung chuyển màu hover nhẹ cho product-toggle, transition 180 ms, focus-visible rõ khi dùng bàn phím; không làm đổi kích thước thao tác. Kiểm tra chế độ giảm chuyển động và tương phản, giữ hành vi details/summary.</w:t>
+        <w:t xml:space="preserve">Bổ sung chuyển màu hover nhẹ cho product-toggle, transition 180ms, focus-visible rõ khi dùng bàn phím; không làm đổi kích thước thao tác. Kiểm tra chế độ giảm chuyển động và tương phản, giữ hành vi details/summary.</w:t>
       </w:r>
     </w:p>
     <w:p>
@@ -8365,11 +8464,11 @@
         <w:pStyle w:val="FirstParagraph"/>
       </w:pPr>
       <w:r>
-        <w:t xml:space="preserve">Kết quả: nền trắng/chữ xanh chuyển thành nền xanh/chữ trắng, chiều cao vẫn 48 px. Focus viền solid 3 px, offset 3 px. Reduced-motion đưa transition về 0s. Công cụ tiếp cận và đối chiếu màu bổ sung được ghi riêng, không nhận là chứng nhận WCAG.</w:t>
-      </w:r>
-    </w:p>
-    <w:bookmarkEnd w:id="88"/>
-    <w:bookmarkStart w:id="89" w:name="prompt-8--kiểm-tra-và-sửa-ít-thay-đổi"/>
+        <w:t xml:space="preserve">Kết quả: nền trắng/chữ xanh chuyển thành nền xanh/chữ trắng, chiều cao vẫn 48 px. Focus viền solid 3 px, offset 3 px. Reduced-motion đưa transition về 0 s. Công cụ tiếp cận và đối chiếu màu bổ sung được ghi riêng, không nhận là chứng nhận WCAG.</w:t>
+      </w:r>
+    </w:p>
+    <w:bookmarkEnd w:id="89"/>
+    <w:bookmarkStart w:id="90" w:name="prompt-8--kiểm-tra-và-sửa-ít-thay-đổi"/>
     <w:p>
       <w:pPr>
         <w:pStyle w:val="Heading2"/>
@@ -8383,7 +8482,7 @@
         <w:pStyle w:val="BlockText"/>
       </w:pPr>
       <w:r>
-        <w:t xml:space="preserve">Mô tả ở 768 px vẫn min-height 72 px dù media trước đặt 44 px; khối giá vẫn 118 px thay 108 px. Xác định nguyên nhân từ thứ tự CSS, đề xuất sửa tối thiểu và kiểm tra lại. Phân biệt điều đã đo và rủi ro cần phòng tránh khi đổi HTML.</w:t>
+        <w:t xml:space="preserve">Mô tả ở 768 px vẫn min-height 72px dù media trước đặt 44px; khối giá vẫn 118px thay 108px. Xác định nguyên nhân từ thứ tự CSS, đề xuất sửa tối thiểu và kiểm tra lại. Phân biệt điều đã đo và rủi ro cần phòng tránh khi đổi HTML.</w:t>
       </w:r>
     </w:p>
     <w:p>
@@ -8394,8 +8493,8 @@
         <w:t xml:space="preserve">Kết quả: các khai báo cùng selector ở cuối file đã ghi đè quy tắc media. Bỏ các min-height cạnh tranh, dùng bố cục flex. Sau sửa mô tả khoảng 47,59 px theo nội dung. Đồng thời chuyển lọc sang li để phòng ô trống sau khi thêm ul/li. Kiểm tra bảy chiều rộng, 21 tình huống lọc, đặt lại, ảnh, liên kết và bàn phím đều đạt trong lượt thử.</w:t>
       </w:r>
     </w:p>
-    <w:bookmarkEnd w:id="89"/>
-    <w:bookmarkStart w:id="90" w:name="prompt-9--hoàn-thiện-readme"/>
+    <w:bookmarkEnd w:id="90"/>
+    <w:bookmarkStart w:id="91" w:name="prompt-9--hoàn-thiện-readme"/>
     <w:p>
       <w:pPr>
         <w:pStyle w:val="Heading2"/>
@@ -8420,8 +8519,8 @@
         <w:t xml:space="preserve">Kết quả: README trỏ tới hồ sơ Buổi 2, câu hỏi kiến thức, bài sửa trực tiếp, kiểm thử và báo cáo; giữ liên kết hồ sơ Buổi 1. Repo và Pages có trạng thái riêng; hoạt động cá nhân chưa được xác nhận thay.</w:t>
       </w:r>
     </w:p>
-    <w:bookmarkEnd w:id="90"/>
-    <w:bookmarkStart w:id="91" w:name="Xa2f2753e92918d0826312cde60d89cfad914fd5"/>
+    <w:bookmarkEnd w:id="91"/>
+    <w:bookmarkStart w:id="92" w:name="Xa2f2753e92918d0826312cde60d89cfad914fd5"/>
     <w:p>
       <w:pPr>
         <w:pStyle w:val="Heading2"/>
@@ -8438,9 +8537,9 @@
         <w:t xml:space="preserve">Giữ website/dữ liệu cũ; không dùng đề xuất tạo website mới hoặc thêm framework/JavaScript. Bổ sung ul/li sau khi kiểm tra ngữ nghĩa và cập nhật lọc theo li. Thay min-height cứng sau đo CSS thực. Chọn contain thay cover để giữ toàn hình. Giữ sự phân biệt hover/focus cũ đã có với transition mới bổ sung. Không nhận giá/số đếm tự lấy từ JSON, không nhận kiểm thử công cụ là sinh viên tự làm.</w:t>
       </w:r>
     </w:p>
-    <w:bookmarkEnd w:id="91"/>
     <w:bookmarkEnd w:id="92"/>
-    <w:bookmarkStart w:id="99" w:name="X4dc22e384a96c0d4f6f824a4bd51b50297dcebb"/>
+    <w:bookmarkEnd w:id="93"/>
+    <w:bookmarkStart w:id="100" w:name="X4dc22e384a96c0d4f6f824a4bd51b50297dcebb"/>
     <w:p>
       <w:pPr>
         <w:pStyle w:val="Heading1"/>
@@ -8450,7 +8549,7 @@
         <w:t xml:space="preserve">8. GitHub, bàn giao, cách chạy và định hướng</w:t>
       </w:r>
     </w:p>
-    <w:bookmarkStart w:id="95" w:name="Xb00897629ec2ca564635bdd839dff8a2818df59"/>
+    <w:bookmarkStart w:id="96" w:name="Xb00897629ec2ca564635bdd839dff8a2818df59"/>
     <w:p>
       <w:pPr>
         <w:pStyle w:val="Heading2"/>
@@ -8469,7 +8568,7 @@
       <w:r>
         <w:t xml:space="preserve"> </w:t>
       </w:r>
-      <w:hyperlink r:id="rId93">
+      <w:hyperlink r:id="rId94">
         <w:r>
           <w:rPr>
             <w:rStyle w:val="Hyperlink"/>
@@ -8504,7 +8603,7 @@
       <w:r>
         <w:t xml:space="preserve"> </w:t>
       </w:r>
-      <w:hyperlink r:id="rId94">
+      <w:hyperlink r:id="rId95">
         <w:r>
           <w:rPr>
             <w:rStyle w:val="Hyperlink"/>
@@ -8521,11 +8620,11 @@
         <w:pStyle w:val="BodyText"/>
       </w:pPr>
       <w:r>
-        <w:t xml:space="preserve">API đọc Pages ngày22/10 trả404; chưa xác nhận có website Pages hoạt động. Hạn chế tạo Pages của tích hợp đã ghi ở phiên20/10; không coi repository Public là đã triển khai giao diện. Bài này công khai mã và báo cáo; muốn dùng Pages cần vào Settings → Pages → Deploy from a branch → main → /(root) → Save, chờ rồi mở URL thật để kiểm tra.</w:t>
-      </w:r>
-    </w:p>
-    <w:bookmarkEnd w:id="95"/>
-    <w:bookmarkStart w:id="96" w:name="Xecc7cc97927b8aac2a87abce9b515464039b6ee"/>
+        <w:t xml:space="preserve">API đọc Pages ngày 22/10 trả 404; chưa xác nhận có website Pages hoạt động. Hạn chế tạo Pages của tích hợp đã ghi ở phiên 20/10; không coi repository Public là đã triển khai giao diện. Bài này công khai mã và báo cáo; muốn dùng Pages cần vào Settings → Pages → Deploy from a branch → main → /(root) → Save, chờ rồi mở URL thật để kiểm tra.</w:t>
+      </w:r>
+    </w:p>
+    <w:bookmarkEnd w:id="96"/>
+    <w:bookmarkStart w:id="97" w:name="Xecc7cc97927b8aac2a87abce9b515464039b6ee"/>
     <w:p>
       <w:pPr>
         <w:pStyle w:val="Heading2"/>
@@ -8699,11 +8798,11 @@
         <w:pStyle w:val="BodyText"/>
       </w:pPr>
       <w:r>
-        <w:t xml:space="preserve">Trước khi nộp, tự xem giao diện1366/768/390 px, thử lọc/đặt lại/chi tiết/hover/focus, làm một thay đổi nhỏ có lý do và ghi kết quả. Khi đổi dữ liệu giá cần sửa đồng nhất HTML và products.json. Khi luyện đổi cột/padding/gap phải lưu ý media query phía sau đang ghi đè ở độ rộng nào.</w:t>
-      </w:r>
-    </w:p>
-    <w:bookmarkEnd w:id="96"/>
-    <w:bookmarkStart w:id="97" w:name="X2c2f9c3d37c87e4d5277112da17874a35d0dfb6"/>
+        <w:t xml:space="preserve">Trước khi nộp, tự xem giao diện 1366/768/390 px, thử lọc/đặt lại/chi tiết/hover/focus, làm một thay đổi nhỏ có lý do và ghi kết quả. Khi đổi dữ liệu giá cần sửa đồng nhất HTML và products.json. Khi luyện đổi cột/padding/gap phải lưu ý media query phía sau đang ghi đè ở độ rộng nào.</w:t>
+      </w:r>
+    </w:p>
+    <w:bookmarkEnd w:id="97"/>
+    <w:bookmarkStart w:id="98" w:name="X2c2f9c3d37c87e4d5277112da17874a35d0dfb6"/>
     <w:p>
       <w:pPr>
         <w:pStyle w:val="Heading2"/>
@@ -8728,8 +8827,8 @@
         <w:t xml:space="preserve">Hướng Buổi 3 là bổ sung JavaScript cho tìm kiếm, lọc/sắp xếp theo dữ liệu và thêm sản phẩm vào giỏ. Không thực hiện trước các chức năng đó trong bài Buổi 2. Các lớp, thuộc tính nhóm và cấu trúc bốn thẻ hiện tại là nền tảng tiếp tục, nhưng số đếm/giá vẫn là nội dung tĩnh.</w:t>
       </w:r>
     </w:p>
-    <w:bookmarkEnd w:id="97"/>
-    <w:bookmarkStart w:id="98" w:name="Xddbbab8794aff6091a2fa2a4dd7e3271eb58ec8"/>
+    <w:bookmarkEnd w:id="98"/>
+    <w:bookmarkStart w:id="99" w:name="Xddbbab8794aff6091a2fa2a4dd7e3271eb58ec8"/>
     <w:p>
       <w:pPr>
         <w:pStyle w:val="Heading2"/>
@@ -8784,7 +8883,7 @@
         </w:numPr>
       </w:pPr>
       <w:r>
-        <w:t xml:space="preserve">Mã Buổi 2 commitafdd5c8; log và ảnh evidence/buoi2, ngày22/10/2026. Căn cứ số đo, kiểm thử và kết quả sau sửa.</w:t>
+        <w:t xml:space="preserve">Mã Buổi 2 commit afdd5c8; log và ảnh evidence/buoi2, ngày 22/10/2026. Căn cứ số đo, kiểm thử và kết quả sau sửa.</w:t>
       </w:r>
     </w:p>
     <w:p>
@@ -8807,9 +8906,9 @@
         <w:t xml:space="preserve">Không dùng infographic của đề làm ảnh kết quả riêng. Các ảnh trong báo cáo là chụp thật của Phong Select hoặc thí nghiệm DOM được ghi rõ. Nguồn Lazada của Buổi 1 giữ riêng ở evidence/khao-sat, không gán là khảo sát mới của Buổi 2.</w:t>
       </w:r>
     </w:p>
-    <w:bookmarkEnd w:id="98"/>
     <w:bookmarkEnd w:id="99"/>
-    <w:bookmarkStart w:id="100" w:name="phụ-lục--phiếu-thực-hành-cá-nhân"/>
+    <w:bookmarkEnd w:id="100"/>
+    <w:bookmarkStart w:id="101" w:name="phụ-lục--phiếu-thực-hành-cá-nhân"/>
     <w:p>
       <w:pPr>
         <w:pStyle w:val="Heading1"/>
@@ -9244,7 +9343,7 @@
         <w:t xml:space="preserve">Có thể điền trong Word hoặc TU_KIEM_TRA.md; khi chỉnh báo cáo Word hãy xuất lại PDF để nhất quán. Chuẩn bị giải thích ít nhất ba phần tử HTML và luyện năm tình huống sửa mã trước khi trình bày.</w:t>
       </w:r>
     </w:p>
-    <w:bookmarkEnd w:id="100"/>
+    <w:bookmarkEnd w:id="101"/>
     <w:sectPr>
       <w:headerReference w:type="default" r:id="rId9"/>
       <w:footerReference w:type="default" r:id="rId10"/>

</xml_diff>